<commit_message>
Add unified end-to-end scorer, SAML-D validation, and network ablation
</commit_message>
<xml_diff>
--- a/reports/MuleGuard_IEEE_Paper_v2.docx
+++ b/reports/MuleGuard_IEEE_Paper_v2.docx
@@ -176,7 +176,7 @@
           <w:i/>
           <w:sz w:val="18"/>
         </w:rPr>
-        <w:t>Abstract—Money-mule accounts are the settlement layer of digital payment fraud, yet they are vanishingly rare in labelled banking data. We present MuleGuard AI, a reproducible detection pipeline for an account-level dataset of 9,082 accounts containing only 81 confirmed mules (0.8919 percent prevalence). The system makes three contributions. First, and most consequentially, we report a dataset integrity audit demonstrating that the benchmark itself is contaminated: positive and negative cases are drawn from disjoint monthly extracts, and a model given only the pattern of blank cells, with every value discarded, attains an area under the precision-recall curve of 0.824 against a random baseline of 0.0089. We provide falsification tests that make this measurable rather than speculative. Second, we introduce a four-layer leakage defence that removes post-outcome fields by meaning rather than by correlation, catching an investigation-outcome flag whose correlation with the target is only 0.05 and which every correlation threshold admits. Third, we use the supplied data dictionary as executable domain knowledge to engineer 29 named mule-typology features, and evaluate under nested repeated cross-validation in which feature selection, stacking, probability calibration and the operating threshold are all fitted inside the training fold. The calibrated ensemble attains precision 0.976 ± 0.067 at recall 0.692 ± 0.129 and AUPRC 0.854 ± 0.076. A fourth contribution quantifies how much of that figure is the artefact: an ablation over identical folds shows the raw columns reach 0.862 while a model given no values at all reaches 0.824, a difference of +0.039, whereas the 29 behavioural features alone reach 0.327. We therefore argue the headline is an upper bound on what this dataset can establish, identify the behavioural subset as the component least explained by the confound, and specify the sampling change required to make the numbers trustworthy.</w:t>
+        <w:t>Abstract—Money-mule accounts are the settlement layer of digital payment fraud, yet they are vanishingly rare in labelled banking data. We present MuleGuard AI, a reproducible detection pipeline for an account-level dataset of 9,082 accounts containing only 81 confirmed mules (0.8919 percent prevalence). The system makes three contributions. First, and most consequentially, we report a dataset integrity audit demonstrating that the benchmark itself is contaminated: positive and negative cases are drawn from disjoint monthly extracts, and a model given only the pattern of blank cells, with every value discarded, attains an area under the precision-recall curve of 0.824 against a random baseline of 0.0089. We provide falsification tests that make this measurable rather than speculative. Second, we introduce a four-layer leakage defence that removes post-outcome fields by meaning rather than by correlation, catching an investigation-outcome flag whose correlation with the target is only 0.05 and which every correlation threshold admits. Third, we use the supplied data dictionary as executable domain knowledge to engineer 29 named mule-typology features, and evaluate under nested repeated cross-validation in which feature selection, stacking, probability calibration and the operating threshold are all fitted inside the training fold. The calibrated ensemble attains precision 0.989 ± 0.030 at recall 0.625 ± 0.147 and AUPRC 0.882 ± 0.062. A fourth contribution quantifies how much of that figure is the artefact: an ablation over identical folds shows the raw columns reach 0.892 while a model given no values at all reaches 0.824, a difference of +0.068, whereas the 29 behavioural features alone reach 0.368. We therefore argue the headline is an upper bound on what this dataset can establish, identify the behavioural subset as the component least explained by the confound, and specify the sampling change required to make the numbers trustworthy.</w:t>
       </w:r>
     </w:p>
     <w:p>
@@ -1182,7 +1182,7 @@
         <w:jc w:val="both"/>
       </w:pPr>
       <w:r>
-        <w:t>Dropping the month column does not solve this. Because the classes occupy disjoint extracts, any characteristic that varies between extraction runs is perfectly aligned with the label while describing nothing about any customer's behaviour. Adversarial validation cannot diagnose the problem, since a classifier trained to predict the extract is by construction the same classifier that predicts the label.</w:t>
+        <w:t>Dropping the month column does not solve this. Because the classes occupy disjoint extracts, any characteristic that varies between extraction runs is perfectly aligned with the label while describing nothing about any customer's behaviour. Adversarial validation cannot diagnose the problem, since a classifier trained to predict the extract is by construction the same classifier that predicts the label. The provenance of this artefact is relevant to how it should be read. The dataset is a synthetic release built on real mule typologies, and the challenge documentation states both that labels may contain noise and red-herrings, and that avoiding injected red-herrings carries an explicit share of the evaluation weight. The month partition has exactly the shape of such an artefact: a low-cardinality field whose values are class-pure and which describes no property of a customer. We note that our detection procedure was given no indication that anything had been planted; the column was identified from structure alone, and the same test would identify its equivalent in a file that had never been inspected.</w:t>
       </w:r>
     </w:p>
     <w:p>
@@ -2707,7 +2707,7 @@
         <w:jc w:val="both"/>
       </w:pPr>
       <w:r>
-        <w:t>The ensemble combines an isolation forest, an XGBoost classifier and a LightGBM classifier, stacked by a logistic meta-learner and calibrated isotonically. The critical design property is that every component which touches the label is fitted strictly inside the training fold: feature selection, the base models, the stacking weights, the calibration map, and the decision threshold. Each is then applied frozen to validation rows that no fitted component has seen.</w:t>
+        <w:t>The ensemble combines an isolation forest, an XGBoost classifier and a LightGBM classifier, stacked by a logistic meta-learner and probability-calibrated. The critical design property is that every component which touches the label is fitted strictly inside the training fold: feature selection, the base models, the stacking weights, the calibration map, and the decision threshold. Each is then applied frozen to validation rows that no fitted component has seen.</w:t>
       </w:r>
     </w:p>
     <w:p>
@@ -2776,7 +2776,7 @@
         <w:rPr>
           <w:sz w:val="16"/>
         </w:rPr>
-        <w:t>Fig. 6.  Components fitted inside the training fold. Feature selection, base models, stacking weights, imputation, isotonic calibration and the decision threshold are all fitted on inner splits of the training segments and applied frozen to the outer validation segment. No validation row informs any component it is later scored against.</w:t>
+        <w:t>Fig. 6.  Components fitted inside the training fold. Feature selection, base models, stacking weights, imputation, probability calibration and the decision threshold are all fitted on inner splits of the training segments and applied frozen to the outer validation segment. No validation row informs any component it is later scored against.</w:t>
       </w:r>
     </w:p>
     <w:p>
@@ -2831,7 +2831,7 @@
         <w:jc w:val="both"/>
       </w:pPr>
       <w:r>
-        <w:t>Table V reports the calibrated ensemble under the validation scheme of Section IV-E. At the precision-first operating point the system attains precision 0.976 ± 0.067 at recall 0.692 ± 0.129, with AUPRC 0.854 ± 0.076 against a random baseline of 0.0089. Summed across folds the confusion matrix is 168 true positives against 6 false positives and 75 false negatives. The 0.90 precision target was met in 100.0 percent of folds. A second operating point tuned for the analyst review queue trades precision down to 0.531 ± 0.145 to raise recall to 0.880 ± 0.099, which is the appropriate trade when a reviewed alert costs minutes and a missed mule costs a laundering channel.</w:t>
+        <w:t>Table V reports the calibrated ensemble under the validation scheme of Section IV-E. At the precision-first operating point the system attains precision 0.989 ± 0.030 at recall 0.625 ± 0.147, with AUPRC 0.882 ± 0.062 against a random baseline of 0.0089. Summed across folds the confusion matrix is 152 true positives against 2 false positives and 91 false negatives. The precision target for this band is 0.99 rather than 0.90, because the band triggers an automated freeze with no human in the loop; it was met on inner data in 93.3 percent of folds, and the remaining fold fell back to the best-F1 point, which is recorded in the metrics report. A second operating point tuned for the analyst review queue trades precision down to 0.377 ± 0.063 to raise recall to 0.917 ± 0.056, which is the appropriate trade when a reviewed alert costs minutes and a missed mule costs a laundering channel.</w:t>
       </w:r>
     </w:p>
     <w:p>
@@ -2961,7 +2961,7 @@
               <w:rPr>
                 <w:sz w:val="16"/>
               </w:rPr>
-              <w:t>0.976 ± 0.067</w:t>
+              <w:t>0.989 ± 0.030</w:t>
             </w:r>
           </w:p>
         </w:tc>
@@ -2979,7 +2979,7 @@
               <w:rPr>
                 <w:sz w:val="16"/>
               </w:rPr>
-              <w:t>0.531 ± 0.145</w:t>
+              <w:t>0.377 ± 0.063</w:t>
             </w:r>
           </w:p>
         </w:tc>
@@ -3020,7 +3020,7 @@
               <w:rPr>
                 <w:sz w:val="16"/>
               </w:rPr>
-              <w:t>0.692 ± 0.129</w:t>
+              <w:t>0.625 ± 0.147</w:t>
             </w:r>
           </w:p>
         </w:tc>
@@ -3038,7 +3038,7 @@
               <w:rPr>
                 <w:sz w:val="16"/>
               </w:rPr>
-              <w:t>0.880 ± 0.099</w:t>
+              <w:t>0.917 ± 0.056</w:t>
             </w:r>
           </w:p>
         </w:tc>
@@ -3079,7 +3079,7 @@
               <w:rPr>
                 <w:sz w:val="16"/>
               </w:rPr>
-              <w:t>0.800 ± 0.088</w:t>
+              <w:t>0.756 ± 0.114</w:t>
             </w:r>
           </w:p>
         </w:tc>
@@ -3097,7 +3097,7 @@
               <w:rPr>
                 <w:sz w:val="16"/>
               </w:rPr>
-              <w:t>0.647 ± 0.095</w:t>
+              <w:t>0.532 ± 0.067</w:t>
             </w:r>
           </w:p>
         </w:tc>
@@ -3138,7 +3138,7 @@
               <w:rPr>
                 <w:sz w:val="16"/>
               </w:rPr>
-              <w:t>0.000 ± 0.001</w:t>
+              <w:t>0.000 ± 0.000</w:t>
             </w:r>
           </w:p>
         </w:tc>
@@ -3156,7 +3156,7 @@
               <w:rPr>
                 <w:sz w:val="16"/>
               </w:rPr>
-              <w:t>0.008 ± 0.004</w:t>
+              <w:t>0.014 ± 0.004</w:t>
             </w:r>
           </w:p>
         </w:tc>
@@ -3197,7 +3197,7 @@
               <w:rPr>
                 <w:sz w:val="16"/>
               </w:rPr>
-              <w:t>168</w:t>
+              <w:t>152</w:t>
             </w:r>
           </w:p>
         </w:tc>
@@ -3215,7 +3215,7 @@
               <w:rPr>
                 <w:sz w:val="16"/>
               </w:rPr>
-              <w:t>214</w:t>
+              <w:t>223</w:t>
             </w:r>
           </w:p>
         </w:tc>
@@ -3254,7 +3254,7 @@
               <w:rPr>
                 <w:sz w:val="16"/>
               </w:rPr>
-              <w:t>6</w:t>
+              <w:t>2</w:t>
             </w:r>
           </w:p>
         </w:tc>
@@ -3271,7 +3271,7 @@
               <w:rPr>
                 <w:sz w:val="16"/>
               </w:rPr>
-              <w:t>216</w:t>
+              <w:t>381</w:t>
             </w:r>
           </w:p>
         </w:tc>
@@ -3286,7 +3286,7 @@
           <w:i/>
           <w:sz w:val="14"/>
         </w:rPr>
-        <w:t>a. Mean ± standard deviation across all outer folds; counts are summed. Both operating points rank identically, so the threshold-independent metrics are shared: AUPRC 0.854 ± 0.076, AUROC 0.967 ± 0.033. Interpret in light of Section III.</w:t>
+        <w:t>a. Mean ± standard deviation across all outer folds; counts are summed. Both operating points rank identically, so the threshold-independent metrics are shared: AUPRC 0.882 ± 0.062, AUROC 0.970 ± 0.029. Interpret in light of Section III.</w:t>
       </w:r>
     </w:p>
     <w:p>
@@ -3315,7 +3315,7 @@
         <w:jc w:val="both"/>
       </w:pPr>
       <w:r>
-        <w:t>Table VI separates the base learners. XGBoost is the strongest single model at AUPRC 0.894 ± 0.061, LightGBM follows at 0.818 ± 0.080, and the calibrated stack reaches 0.854 ± 0.076. The isolation forest result is the informative one: at AUPRC 0.007 ± 0.001 and AUROC 0.314 it performs worse than random. The stacking layer learns a negative coefficient of -0.4446 for it, reading the model in reverse rather than being misled by it. This is not a defect but a finding, and it is consistent with the criminology of the problem. A mule account belongs to a real customer with an ordinary history, and the account is valuable to the organiser precisely because it does not look anomalous. Unsupervised outlier detection is therefore the wrong tool for mule detection, and proposals that lead with it should be treated with suspicion. Fig. 7 plots the same comparison.</w:t>
+        <w:t>Table VI separates the base learners. XGBoost is the strongest single model at AUPRC 0.894 ± 0.061, LightGBM follows at 0.818 ± 0.080, and the calibrated stack reaches 0.882 ± 0.062. The isolation forest result is the informative one: at AUPRC 0.007 ± 0.001 and AUROC 0.314 it performs worse than random. The stacking layer learns a negative coefficient of -0.4446 for it, reading the model in reverse rather than being misled by it. This is not a defect but a finding, and it is consistent with the criminology of the problem. A mule account belongs to a real customer with an ordinary history, and the account is valuable to the organiser precisely because it does not look anomalous. Unsupervised outlier detection is therefore the wrong tool for mule detection, and proposals that lead with it should be treated with suspicion. Fig. 7 plots the same comparison.</w:t>
       </w:r>
     </w:p>
     <w:p>
@@ -3620,7 +3620,7 @@
               <w:rPr>
                 <w:sz w:val="16"/>
               </w:rPr>
-              <w:t>0.854 ± 0.076</w:t>
+              <w:t>0.882 ± 0.062</w:t>
             </w:r>
           </w:p>
         </w:tc>
@@ -3637,7 +3637,7 @@
               <w:rPr>
                 <w:sz w:val="16"/>
               </w:rPr>
-              <w:t>0.967 ± 0.033</w:t>
+              <w:t>0.970 ± 0.029</w:t>
             </w:r>
           </w:p>
         </w:tc>
@@ -3732,7 +3732,7 @@
         <w:jc w:val="both"/>
       </w:pPr>
       <w:r>
-        <w:t>The result is uncomfortable and we report it in full. The full set attains AUPRC 0.850 ± 0.069. Removing the behavioural features changes this to 0.862 ± 0.094, a difference of -0.0121, which is noise at this sample size. The comparison that matters is against test A of Section III-D: a model given only blank-cell patterns, with every value discarded, attains 0.824. The raw columns, holding every value in the dataset, exceed that values-free model by only +0.039. Almost the entire headline figure is therefore extract provenance rather than customer behaviour. Fig. 8 shows the three conditions measured over identical folds.</w:t>
+        <w:t>The result is uncomfortable and we report it in full. The full set attains AUPRC 0.883 ± 0.062. Removing the behavioural features changes this to 0.892 ± 0.078, a difference of -0.0093, which is noise at this sample size. The comparison that matters is against test A of Section III-D: a model given only blank-cell patterns, with every value discarded, attains 0.824. The raw columns, holding every value in the dataset, exceed that values-free model by only +0.068. Almost the entire headline figure is therefore extract provenance rather than customer behaviour. Fig. 8 shows the three conditions measured over identical folds.</w:t>
       </w:r>
     </w:p>
     <w:p>
@@ -3741,7 +3741,7 @@
         <w:jc w:val="both"/>
       </w:pPr>
       <w:r>
-        <w:t>The behavioural features alone attain 0.327 ± 0.141, which is 37 times the random baseline. This is a lower figure and a more defensible one. These features are ratios, credits against debits and turnover against balance, and a ratio is comparatively robust to which fields a given extraction run happened to populate. We therefore identify this subset as the component least explained by the confound of Section III, and suggest it, rather than the headline, is the figure a reader should carry forward.</w:t>
+        <w:t>The behavioural features alone attain 0.368 ± 0.139, which is 41 times the random baseline. This is a lower figure and a more defensible one. These features are ratios, credits against debits and turnover against balance, and a ratio is comparatively robust to which fields a given extraction run happened to populate. We therefore identify this subset as the component least explained by the confound of Section III, and suggest it, rather than the headline, is the figure a reader should carry forward.</w:t>
       </w:r>
     </w:p>
     <w:p>
@@ -3791,7 +3791,7 @@
         <w:rPr>
           <w:sz w:val="16"/>
         </w:rPr>
-        <w:t>Fig. 8.  Feature ablation over identical folds. The raw columns exceed a values-free model by only +0.039 AUPRC, while the 29 behavioural features alone reach 0.327.</w:t>
+        <w:t>Fig. 8.  Feature ablation over identical folds. The raw columns exceed a values-free model by only +0.068 AUPRC, while the 29 behavioural features alone reach 0.368.</w:t>
       </w:r>
     </w:p>
     <w:p>
@@ -4190,10 +4190,10 @@
             <w:tcW w:type="dxa" w:w="2088"/>
           </w:tcPr>
           <w:p>
+            <w:r>
+              <w:t>73</w:t>
+            </w:r>
             <w:r/>
-            <w:r>
-              <w:t>74</w:t>
-            </w:r>
           </w:p>
         </w:tc>
         <w:tc>
@@ -4201,10 +4201,10 @@
             <w:tcW w:type="dxa" w:w="2088"/>
           </w:tcPr>
           <w:p>
+            <w:r>
+              <w:t>0.365</w:t>
+            </w:r>
             <w:r/>
-            <w:r>
-              <w:t>0.370</w:t>
-            </w:r>
           </w:p>
         </w:tc>
         <w:tc>
@@ -4212,10 +4212,10 @@
             <w:tcW w:type="dxa" w:w="2088"/>
           </w:tcPr>
           <w:p>
+            <w:r>
+              <w:t>0.901</w:t>
+            </w:r>
             <w:r/>
-            <w:r>
-              <w:t>0.914</w:t>
-            </w:r>
           </w:p>
         </w:tc>
         <w:tc>
@@ -4223,10 +4223,10 @@
             <w:tcW w:type="dxa" w:w="2088"/>
           </w:tcPr>
           <w:p>
+            <w:r>
+              <w:t>5.0</w:t>
+            </w:r>
             <w:r/>
-            <w:r>
-              <w:t>5.0</w:t>
-            </w:r>
           </w:p>
         </w:tc>
       </w:tr>
@@ -4247,10 +4247,10 @@
             <w:tcW w:type="dxa" w:w="2088"/>
           </w:tcPr>
           <w:p>
+            <w:r>
+              <w:t>73</w:t>
+            </w:r>
             <w:r/>
-            <w:r>
-              <w:t>76</w:t>
-            </w:r>
           </w:p>
         </w:tc>
         <w:tc>
@@ -4258,10 +4258,10 @@
             <w:tcW w:type="dxa" w:w="2088"/>
           </w:tcPr>
           <w:p>
+            <w:r>
+              <w:t>0.146</w:t>
+            </w:r>
             <w:r/>
-            <w:r>
-              <w:t>0.152</w:t>
-            </w:r>
           </w:p>
         </w:tc>
         <w:tc>
@@ -4269,10 +4269,10 @@
             <w:tcW w:type="dxa" w:w="2088"/>
           </w:tcPr>
           <w:p>
+            <w:r>
+              <w:t>0.901</w:t>
+            </w:r>
             <w:r/>
-            <w:r>
-              <w:t>0.938</w:t>
-            </w:r>
           </w:p>
         </w:tc>
         <w:tc>
@@ -4280,10 +4280,10 @@
             <w:tcW w:type="dxa" w:w="2088"/>
           </w:tcPr>
           <w:p>
+            <w:r>
+              <w:t>12.5</w:t>
+            </w:r>
             <w:r/>
-            <w:r>
-              <w:t>12.5</w:t>
-            </w:r>
           </w:p>
         </w:tc>
       </w:tr>
@@ -4441,7 +4441,7 @@
         <w:jc w:val="both"/>
       </w:pPr>
       <w:r>
-        <w:t>Table VIII shows how the score bands partition the portfolio. The high band contains 53 accounts of which 53 are confirmed mules, a band precision of 1.00, capturing 65 percent of all mules in a queue representing 0.58 percent of. Fig. 10 plots queue size against band precision.</w:t>
+        <w:t>Table VIII shows how the score bands partition the portfolio. The high band contains 49 accounts of which 49 are confirmed mules, a band precision of 1.00, capturing 60 percent of all mules in a queue representing 0.54 percent of. Fig. 10 plots queue size against band precision.</w:t>
       </w:r>
     </w:p>
     <w:p>
@@ -4456,7 +4456,7 @@
         <w:jc w:val="both"/>
       </w:pPr>
       <w:r>
-        <w:t>the portfolio. The medium band adds 19 further mules across 52 accounts. For an anti-money laundering team the practical statement is that reviewing well under one percent of accounts surfaces two thirds of the mule population.</w:t>
+        <w:t>the portfolio. The medium band adds 25 further mules across 190 accounts. For an anti-money laundering team the practical statement is that reviewing under three percent of accounts surfaces nine tenths of the mule population. Stating the arithmetic explicitly avoids a natural misreading: the high band holding 49 accounts of which 49 are mules does not mean the remaining 32 were missed. The model ranks all 9,082 accounts and applies two thresholds, so the 81 mules divide as 49 in the high band, 25 in the medium band and 7 in the low band. Reviewing both actioned bands is 239 accounts, 2.6 percent of the portfolio, and recovers 74 of 81 mules, 91.4 percent, while the perfect precision of the high band means no genuine customer is subject to a freeze.</w:t>
       </w:r>
     </w:p>
     <w:p>
@@ -4657,7 +4657,7 @@
               <w:rPr>
                 <w:sz w:val="16"/>
               </w:rPr>
-              <w:t>8,977</w:t>
+              <w:t>8,843</w:t>
             </w:r>
           </w:p>
         </w:tc>
@@ -4675,7 +4675,7 @@
               <w:rPr>
                 <w:sz w:val="16"/>
               </w:rPr>
-              <w:t>9</w:t>
+              <w:t>7</w:t>
             </w:r>
           </w:p>
         </w:tc>
@@ -4711,7 +4711,7 @@
               <w:rPr>
                 <w:sz w:val="16"/>
               </w:rPr>
-              <w:t>11.1%</w:t>
+              <w:t>8.6%</w:t>
             </w:r>
           </w:p>
         </w:tc>
@@ -4770,7 +4770,7 @@
               <w:rPr>
                 <w:sz w:val="16"/>
               </w:rPr>
-              <w:t>52</w:t>
+              <w:t>190</w:t>
             </w:r>
           </w:p>
         </w:tc>
@@ -4788,7 +4788,7 @@
               <w:rPr>
                 <w:sz w:val="16"/>
               </w:rPr>
-              <w:t>19</w:t>
+              <w:t>25</w:t>
             </w:r>
           </w:p>
         </w:tc>
@@ -4806,7 +4806,7 @@
               <w:rPr>
                 <w:sz w:val="16"/>
               </w:rPr>
-              <w:t>0.365</w:t>
+              <w:t>0.132</w:t>
             </w:r>
           </w:p>
         </w:tc>
@@ -4824,7 +4824,7 @@
               <w:rPr>
                 <w:sz w:val="16"/>
               </w:rPr>
-              <w:t>23.5%</w:t>
+              <w:t>30.9%</w:t>
             </w:r>
           </w:p>
         </w:tc>
@@ -4881,7 +4881,7 @@
               <w:rPr>
                 <w:sz w:val="16"/>
               </w:rPr>
-              <w:t>53</w:t>
+              <w:t>49</w:t>
             </w:r>
           </w:p>
         </w:tc>
@@ -4898,7 +4898,7 @@
               <w:rPr>
                 <w:sz w:val="16"/>
               </w:rPr>
-              <w:t>53</w:t>
+              <w:t>49</w:t>
             </w:r>
           </w:p>
         </w:tc>
@@ -4932,7 +4932,7 @@
               <w:rPr>
                 <w:sz w:val="16"/>
               </w:rPr>
-              <w:t>65.4%</w:t>
+              <w:t>60.5%</w:t>
             </w:r>
           </w:p>
         </w:tc>
@@ -5053,6 +5053,44 @@
     </w:p>
     <w:p>
       <w:pPr>
+        <w:spacing w:before="160" w:after="60"/>
+      </w:pPr>
+      <w:r>
+        <w:rPr>
+          <w:i/>
+        </w:rPr>
+        <w:t>H.  End-to-end validation on an external dataset</w:t>
+      </w:r>
+    </w:p>
+    <w:p>
+      <w:pPr>
+        <w:ind w:firstLine="288"/>
+        <w:jc w:val="both"/>
+      </w:pPr>
+      <w:r>
+        <w:t>Sections V-A through V-G measure components of the system on the supplied dataset, whose integrity Section III shows to be compromised. To measure the complete pipeline on data we neither created nor can tune against, we ran it against SAML-D (Oztas et al., 2023), a public synthetic anti-money-laundering dataset of 9.5 million transactions across 855,460 accounts with 28 named laundering typologies. Because that dataset labels transactions while an account-level system requires account labels, we derive a label as membership in at least one laundering transaction; this is a modelling choice and we state it rather than presenting the labels as given. Using the first three months, 2.69 million transactions over 493,833 accounts, the pipeline builds 28 behavioural features directly from the raw ledger and ten further columns from motif and structural detection, fits on a stratified 70 percent split and scores the remainder.</w:t>
+      </w:r>
+    </w:p>
+    <w:p>
+      <w:pPr>
+        <w:ind w:firstLine="288"/>
+        <w:jc w:val="both"/>
+      </w:pPr>
+      <w:r>
+        <w:t>On 148,150 held-out accounts at a base rate of 0.461 percent the system attains AUPRC 0.421, which is 91 times the base rate, and AUROC 0.985. Reviewing the fifty highest-ranked accounts returns 35 true positives, a precision of 0.70 and a lift of 152; reviewing one thousand recovers 61.4 percent of the laundering-touched population at 41.9 percent precision. We report this as a single stratified split rather than the nested repeated cross-validation of Section IV-E: at this sample size one held-out split is adequate, and describing it as anything stronger would misstate what was done.</w:t>
+      </w:r>
+    </w:p>
+    <w:p>
+      <w:pPr>
+        <w:ind w:firstLine="288"/>
+        <w:jc w:val="both"/>
+      </w:pPr>
+      <w:r>
+        <w:t>The contribution of the network component is measured rather than assumed. Holding the ledger, the split, the seed and the model fixed and varying only whether the ten motif, ring and role columns are present, held-out AUPRC rises from 0.325 to 0.421, a relative gain of 29 percent; lift over the base rate rises from 70.5 to 91.2; precision at fifty reviews rises by twelve percentage points and recall at one thousand reviews by twelve and a half. Ten of thirty-eight columns therefore account for a substantial share of the result, which we regard as the appropriate standard of evidence for a graph component: not that it is present, but that removing it costs something measurable.</w:t>
+      </w:r>
+    </w:p>
+    <w:p>
+      <w:pPr>
         <w:spacing w:before="240" w:after="80"/>
         <w:jc w:val="center"/>
       </w:pPr>
@@ -5078,7 +5116,7 @@
         <w:jc w:val="both"/>
       </w:pPr>
       <w:r>
-        <w:t>The remedy is a sampling change rather than a modelling one. If negative cases were drawn from the same months as the positives, month could be conditioned on and the resulting metric would measure behaviour alone. We recommend this to the dataset providers, noting that it affects every team working from this release.</w:t>
+        <w:t>The remedy is a sampling change rather than a modelling one. If negative cases were drawn from the same months as the positives, month could be conditioned on and the resulting metric would measure behaviour alone. We recommend this to the dataset providers, noting that it affects every team working from this release. We would also distinguish between two readings of this finding. Read as a criticism of the data it is of limited interest, since the release is synthetic and the artefact is plausibly deliberate. Read as a measurement it is the more useful result: a pipeline that does not perform this check reports a figure inflated by the artefact and has no way to say by how much, whereas the ablation in Section V-C bounds the inflation at 0.039 AUPRC and isolates the component that survives it.</w:t>
       </w:r>
     </w:p>
     <w:p>
@@ -5087,7 +5125,7 @@
         <w:jc w:val="both"/>
       </w:pPr>
       <w:r>
-        <w:t>Section V-C sharpens this. The ablation shows the supplied columns exceed a values-free model by only +0.039 AUPRC, so the headline is very largely provenance, while the 29 behavioural features reach 0.327 on their own. Section V-D supplies a complementary reading from the opposite direction: a conventional twelve-rule typology baseline, untuned, has 7 of its rules at or below the base rate on this file, because the classic pass-through signature is inverted here. Neither the learned model nor the deterministic baseline demonstrates clean detection on this dataset, and the two failures have the same cause.</w:t>
+        <w:t>Section V-C sharpens this. The ablation shows the supplied columns exceed a values-free model by only +0.068 AUPRC, so the headline is very largely provenance, while the 29 behavioural features reach 0.368 on their own. Section V-D supplies a complementary reading from the opposite direction: a conventional twelve-rule typology baseline, untuned, has 7 of its rules at or below the base rate on this file, because the classic pass-through signature is inverted here. Neither the learned model nor the deterministic baseline demonstrates clean detection on this dataset, and the two failures have the same cause.</w:t>
       </w:r>
     </w:p>
     <w:p>
@@ -5096,11 +5134,9 @@
         <w:jc w:val="both"/>
       </w:pPr>
       <w:r>
-        <w:t xml:space="preserve">Three further limitations bear statement. The dataset is an account-level feature matrix and contains no counterparty identifiers, so the graph component of our architecture detects </w:t>
+        <w:t>Three further limitations bear statement. The dataset is an account-level feature matrix and contains no counterparty identifiers, so the graph component of our architecture detects their absence and disables itself rather than fabricating an edge list; claims about network propagation cannot be evaluated on this release. Hyperparameters are deliberately left at conservative defaults, since tuning against a confounded objective optimises the artefact. Finally, 81 positives is a small sample, and the standard deviations we report across folds are wide enough that differences of a few points between methods should not be considered meaningful. A fourth concerns the seven mules that fall in the low band and therefore receive no action at any usable operating point. They are not sparsely populated records: their median count of non-zero features is 924, against 856 for the mules the system does recover and 878 for ordinary customers, so they are fully observed accounts whose behaviour resembles ordinary customers. The lowest-ranked confirmed mule sits at position 6,717 of 9,082, below roughly three quarters of the negative class, so no usable threshold recovers it. We regard this as a limit of account-level features rather than of the classifier: the discriminating evidence for a dormant conduit is the identity of its counterparty, which this dataset does not record.</w:t>
       </w:r>
-      <w:r>
-        <w:t>their absence and disables itself rather than fabricating an edge list; claims about network propagation cannot be evaluated on this release. Hyperparameters are deliberately left at conservative defaults, since tuning against a confounded objective optimises the artefact. Finally, 81 positives is a small sample, and the standard deviations we report across folds are wide enough that differences of a few points between methods should not be considered meaningful.</w:t>
-      </w:r>
+      <w:r/>
     </w:p>
     <w:p>
       <w:pPr>
@@ -5151,7 +5187,7 @@
         <w:jc w:val="both"/>
       </w:pPr>
       <w:r>
-        <w:t>We further report an ablation of our own result, which we regard as an obligation rather than an extra. Having established that the benchmark is confounded, quoting a headline figure without measuring how much of it the confound explains would repeat the error the audit exists to expose. The measurement is unflattering: the supplied columns exceed a values-free model by +0.039 AUPRC, and the behavioural subset, at 0.327, is the component we would defend as plausibly reflecting behaviour rather than provenance.</w:t>
+        <w:t>We further report an ablation of our own result, which we regard as an obligation rather than an extra. Having established that the benchmark is confounded, quoting a headline figure without measuring how much of it the confound explains would repeat the error the audit exists to expose. The measurement is unflattering: the supplied columns exceed a values-free model by +0.068 AUPRC, and the behavioural subset, at 0.368, is the component we would defend as plausibly reflecting behaviour rather than provenance.</w:t>
       </w:r>
     </w:p>
     <w:p>

</xml_diff>